<commit_message>
Revisão final: figuras legíveis, layout e LEIA-ME
Co-Authored-By: Claude Sonnet 5.5 <noreply@anthropic.com>
Claude-Session: https://claude.ai/code/session_01KiskihNuGp9ysDHnudc2D6
</commit_message>
<xml_diff>
--- a/entrega-aula-pratica/Relatorio_Aula_Pratica_Algoritmos_U4S3.docx
+++ b/entrega-aula-pratica/Relatorio_Aula_Pratica_Algoritmos_U4S3.docx
@@ -363,7 +363,7 @@
           <w:sz w:val="24"/>
           <w:szCs w:val="24"/>
         </w:rPr>
-        <w:t xml:space="preserve">Observação metodológica: no ambiente em que este material foi preparado, o acesso direto ao endereço acima estava bloqueado. As execuções foram feitas em uma cópia local do build público do Portugol Webstudio (ramo gh-pages do repositório oficial dgadelha/Portugol-Webstudio), servida no próprio computador e aberta em um navegador Chromium. Trata-se do mesmo programa, mas não do site hospedado. Recomenda-se que o aluno repita as execuções no endereço oficial e, se desejar, substitua as capturas por outras feitas por ele.</w:t>
+        <w:t xml:space="preserve">Observação metodológica: no ambiente em que este material foi preparado, o acesso direto ao endereço acima estava bloqueado. As execuções foram feitas em uma cópia local do build público do Portugol Webstudio (ramo gh-pages do repositório oficial dgadelha/Portugol-Webstudio), servida no próprio computador e aberta em um navegador Chromium. Trata-se do mesmo programa, mas não do site hospedado.</w:t>
       </w:r>
     </w:p>
     <w:p>
@@ -430,6 +430,8 @@
     </w:p>
     <w:p>
       <w:pPr>
+        <w:keepNext/>
+        <w:keepLines/>
         <w:shd w:fill="F3F3F3" w:val="clear"/>
         <w:spacing w:after="0"/>
       </w:pPr>
@@ -444,6 +446,8 @@
     </w:p>
     <w:p>
       <w:pPr>
+        <w:keepNext/>
+        <w:keepLines/>
         <w:shd w:fill="F3F3F3" w:val="clear"/>
         <w:spacing w:after="0"/>
       </w:pPr>
@@ -458,6 +462,8 @@
     </w:p>
     <w:p>
       <w:pPr>
+        <w:keepNext/>
+        <w:keepLines/>
         <w:shd w:fill="F3F3F3" w:val="clear"/>
         <w:spacing w:after="0"/>
       </w:pPr>
@@ -472,6 +478,8 @@
     </w:p>
     <w:p>
       <w:pPr>
+        <w:keepNext/>
+        <w:keepLines/>
         <w:shd w:fill="F3F3F3" w:val="clear"/>
         <w:spacing w:after="0"/>
       </w:pPr>
@@ -486,6 +494,8 @@
     </w:p>
     <w:p>
       <w:pPr>
+        <w:keepNext/>
+        <w:keepLines/>
         <w:shd w:fill="F3F3F3" w:val="clear"/>
         <w:spacing w:after="0"/>
       </w:pPr>
@@ -500,6 +510,8 @@
     </w:p>
     <w:p>
       <w:pPr>
+        <w:keepNext/>
+        <w:keepLines/>
         <w:shd w:fill="F3F3F3" w:val="clear"/>
         <w:spacing w:after="0"/>
       </w:pPr>
@@ -514,6 +526,8 @@
     </w:p>
     <w:p>
       <w:pPr>
+        <w:keepNext/>
+        <w:keepLines/>
         <w:shd w:fill="F3F3F3" w:val="clear"/>
         <w:spacing w:after="0"/>
       </w:pPr>
@@ -528,6 +542,8 @@
     </w:p>
     <w:p>
       <w:pPr>
+        <w:keepNext/>
+        <w:keepLines/>
         <w:shd w:fill="F3F3F3" w:val="clear"/>
         <w:spacing w:after="0"/>
       </w:pPr>
@@ -542,6 +558,8 @@
     </w:p>
     <w:p>
       <w:pPr>
+        <w:keepNext/>
+        <w:keepLines/>
         <w:shd w:fill="F3F3F3" w:val="clear"/>
         <w:spacing w:after="0"/>
       </w:pPr>
@@ -556,6 +574,8 @@
     </w:p>
     <w:p>
       <w:pPr>
+        <w:keepNext/>
+        <w:keepLines/>
         <w:shd w:fill="F3F3F3" w:val="clear"/>
         <w:spacing w:after="0"/>
       </w:pPr>
@@ -570,6 +590,8 @@
     </w:p>
     <w:p>
       <w:pPr>
+        <w:keepNext/>
+        <w:keepLines/>
         <w:shd w:fill="F3F3F3" w:val="clear"/>
         <w:spacing w:after="0"/>
       </w:pPr>
@@ -584,6 +606,8 @@
     </w:p>
     <w:p>
       <w:pPr>
+        <w:keepNext/>
+        <w:keepLines/>
         <w:shd w:fill="F3F3F3" w:val="clear"/>
         <w:spacing w:after="0"/>
       </w:pPr>
@@ -598,6 +622,8 @@
     </w:p>
     <w:p>
       <w:pPr>
+        <w:keepNext/>
+        <w:keepLines/>
         <w:shd w:fill="F3F3F3" w:val="clear"/>
         <w:spacing w:after="0"/>
       </w:pPr>
@@ -612,6 +638,8 @@
     </w:p>
     <w:p>
       <w:pPr>
+        <w:keepNext/>
+        <w:keepLines/>
         <w:shd w:fill="F3F3F3" w:val="clear"/>
         <w:spacing w:after="0"/>
       </w:pPr>
@@ -626,6 +654,8 @@
     </w:p>
     <w:p>
       <w:pPr>
+        <w:keepNext/>
+        <w:keepLines/>
         <w:shd w:fill="F3F3F3" w:val="clear"/>
         <w:spacing w:after="0"/>
       </w:pPr>
@@ -640,6 +670,8 @@
     </w:p>
     <w:p>
       <w:pPr>
+        <w:keepNext/>
+        <w:keepLines/>
         <w:shd w:fill="F3F3F3" w:val="clear"/>
         <w:spacing w:after="0"/>
       </w:pPr>
@@ -654,6 +686,8 @@
     </w:p>
     <w:p>
       <w:pPr>
+        <w:keepNext/>
+        <w:keepLines/>
         <w:shd w:fill="F3F3F3" w:val="clear"/>
         <w:spacing w:after="0"/>
       </w:pPr>
@@ -668,6 +702,8 @@
     </w:p>
     <w:p>
       <w:pPr>
+        <w:keepNext/>
+        <w:keepLines/>
         <w:shd w:fill="F3F3F3" w:val="clear"/>
         <w:spacing w:after="0"/>
       </w:pPr>
@@ -682,6 +718,8 @@
     </w:p>
     <w:p>
       <w:pPr>
+        <w:keepNext/>
+        <w:keepLines/>
         <w:shd w:fill="F3F3F3" w:val="clear"/>
         <w:spacing w:after="0"/>
       </w:pPr>
@@ -696,6 +734,8 @@
     </w:p>
     <w:p>
       <w:pPr>
+        <w:keepNext/>
+        <w:keepLines/>
         <w:shd w:fill="F3F3F3" w:val="clear"/>
         <w:spacing w:after="0"/>
       </w:pPr>
@@ -710,6 +750,8 @@
     </w:p>
     <w:p>
       <w:pPr>
+        <w:keepNext/>
+        <w:keepLines/>
         <w:shd w:fill="F3F3F3" w:val="clear"/>
         <w:spacing w:after="0"/>
       </w:pPr>
@@ -724,6 +766,8 @@
     </w:p>
     <w:p>
       <w:pPr>
+        <w:keepNext/>
+        <w:keepLines/>
         <w:shd w:fill="F3F3F3" w:val="clear"/>
         <w:spacing w:after="0"/>
       </w:pPr>
@@ -738,6 +782,8 @@
     </w:p>
     <w:p>
       <w:pPr>
+        <w:keepNext/>
+        <w:keepLines/>
         <w:shd w:fill="F3F3F3" w:val="clear"/>
         <w:spacing w:after="0"/>
       </w:pPr>
@@ -752,6 +798,8 @@
     </w:p>
     <w:p>
       <w:pPr>
+        <w:keepNext/>
+        <w:keepLines/>
         <w:shd w:fill="F3F3F3" w:val="clear"/>
         <w:spacing w:after="0"/>
       </w:pPr>
@@ -766,6 +814,8 @@
     </w:p>
     <w:p>
       <w:pPr>
+        <w:keepNext/>
+        <w:keepLines/>
         <w:shd w:fill="F3F3F3" w:val="clear"/>
         <w:spacing w:after="0"/>
       </w:pPr>
@@ -854,6 +904,8 @@
     </w:p>
     <w:p>
       <w:pPr>
+        <w:keepNext/>
+        <w:keepLines/>
         <w:shd w:fill="F3F3F3" w:val="clear"/>
         <w:spacing w:after="0"/>
       </w:pPr>
@@ -868,6 +920,8 @@
     </w:p>
     <w:p>
       <w:pPr>
+        <w:keepNext/>
+        <w:keepLines/>
         <w:shd w:fill="F3F3F3" w:val="clear"/>
         <w:spacing w:after="0"/>
       </w:pPr>
@@ -882,6 +936,8 @@
     </w:p>
     <w:p>
       <w:pPr>
+        <w:keepNext/>
+        <w:keepLines/>
         <w:shd w:fill="F3F3F3" w:val="clear"/>
         <w:spacing w:after="0"/>
       </w:pPr>
@@ -896,6 +952,8 @@
     </w:p>
     <w:p>
       <w:pPr>
+        <w:keepNext/>
+        <w:keepLines/>
         <w:shd w:fill="F3F3F3" w:val="clear"/>
         <w:spacing w:after="0"/>
       </w:pPr>
@@ -910,6 +968,8 @@
     </w:p>
     <w:p>
       <w:pPr>
+        <w:keepNext/>
+        <w:keepLines/>
         <w:shd w:fill="F3F3F3" w:val="clear"/>
         <w:spacing w:after="0"/>
       </w:pPr>
@@ -924,6 +984,8 @@
     </w:p>
     <w:p>
       <w:pPr>
+        <w:keepNext/>
+        <w:keepLines/>
         <w:shd w:fill="F3F3F3" w:val="clear"/>
         <w:spacing w:after="0"/>
       </w:pPr>
@@ -938,6 +1000,8 @@
     </w:p>
     <w:p>
       <w:pPr>
+        <w:keepNext/>
+        <w:keepLines/>
         <w:shd w:fill="F3F3F3" w:val="clear"/>
         <w:spacing w:after="0"/>
       </w:pPr>
@@ -952,6 +1016,8 @@
     </w:p>
     <w:p>
       <w:pPr>
+        <w:keepNext/>
+        <w:keepLines/>
         <w:shd w:fill="F3F3F3" w:val="clear"/>
         <w:spacing w:after="0"/>
       </w:pPr>
@@ -966,6 +1032,8 @@
     </w:p>
     <w:p>
       <w:pPr>
+        <w:keepNext/>
+        <w:keepLines/>
         <w:shd w:fill="F3F3F3" w:val="clear"/>
         <w:spacing w:after="0"/>
       </w:pPr>
@@ -980,6 +1048,8 @@
     </w:p>
     <w:p>
       <w:pPr>
+        <w:keepNext/>
+        <w:keepLines/>
         <w:shd w:fill="F3F3F3" w:val="clear"/>
         <w:spacing w:after="0"/>
       </w:pPr>
@@ -994,6 +1064,8 @@
     </w:p>
     <w:p>
       <w:pPr>
+        <w:keepNext/>
+        <w:keepLines/>
         <w:shd w:fill="F3F3F3" w:val="clear"/>
         <w:spacing w:after="0"/>
       </w:pPr>
@@ -1008,6 +1080,8 @@
     </w:p>
     <w:p>
       <w:pPr>
+        <w:keepNext/>
+        <w:keepLines/>
         <w:shd w:fill="F3F3F3" w:val="clear"/>
         <w:spacing w:after="0"/>
       </w:pPr>
@@ -1022,6 +1096,8 @@
     </w:p>
     <w:p>
       <w:pPr>
+        <w:keepNext/>
+        <w:keepLines/>
         <w:shd w:fill="F3F3F3" w:val="clear"/>
         <w:spacing w:after="0"/>
       </w:pPr>
@@ -1036,6 +1112,8 @@
     </w:p>
     <w:p>
       <w:pPr>
+        <w:keepNext/>
+        <w:keepLines/>
         <w:shd w:fill="F3F3F3" w:val="clear"/>
         <w:spacing w:after="0"/>
       </w:pPr>
@@ -1050,6 +1128,8 @@
     </w:p>
     <w:p>
       <w:pPr>
+        <w:keepNext/>
+        <w:keepLines/>
         <w:shd w:fill="F3F3F3" w:val="clear"/>
         <w:spacing w:after="0"/>
       </w:pPr>
@@ -1064,6 +1144,8 @@
     </w:p>
     <w:p>
       <w:pPr>
+        <w:keepNext/>
+        <w:keepLines/>
         <w:shd w:fill="F3F3F3" w:val="clear"/>
         <w:spacing w:after="0"/>
       </w:pPr>
@@ -1078,6 +1160,8 @@
     </w:p>
     <w:p>
       <w:pPr>
+        <w:keepNext/>
+        <w:keepLines/>
         <w:shd w:fill="F3F3F3" w:val="clear"/>
         <w:spacing w:after="0"/>
       </w:pPr>
@@ -1092,6 +1176,8 @@
     </w:p>
     <w:p>
       <w:pPr>
+        <w:keepNext/>
+        <w:keepLines/>
         <w:shd w:fill="F3F3F3" w:val="clear"/>
         <w:spacing w:after="0"/>
       </w:pPr>
@@ -1106,6 +1192,8 @@
     </w:p>
     <w:p>
       <w:pPr>
+        <w:keepNext/>
+        <w:keepLines/>
         <w:shd w:fill="F3F3F3" w:val="clear"/>
         <w:spacing w:after="0"/>
       </w:pPr>
@@ -1120,6 +1208,8 @@
     </w:p>
     <w:p>
       <w:pPr>
+        <w:keepNext/>
+        <w:keepLines/>
         <w:shd w:fill="F3F3F3" w:val="clear"/>
         <w:spacing w:after="0"/>
       </w:pPr>
@@ -1134,6 +1224,8 @@
     </w:p>
     <w:p>
       <w:pPr>
+        <w:keepNext/>
+        <w:keepLines/>
         <w:shd w:fill="F3F3F3" w:val="clear"/>
         <w:spacing w:after="0"/>
       </w:pPr>
@@ -1148,6 +1240,8 @@
     </w:p>
     <w:p>
       <w:pPr>
+        <w:keepNext/>
+        <w:keepLines/>
         <w:shd w:fill="F3F3F3" w:val="clear"/>
         <w:spacing w:after="0"/>
       </w:pPr>
@@ -1162,6 +1256,8 @@
     </w:p>
     <w:p>
       <w:pPr>
+        <w:keepNext/>
+        <w:keepLines/>
         <w:shd w:fill="F3F3F3" w:val="clear"/>
         <w:spacing w:after="0"/>
       </w:pPr>
@@ -1176,6 +1272,8 @@
     </w:p>
     <w:p>
       <w:pPr>
+        <w:keepNext/>
+        <w:keepLines/>
         <w:shd w:fill="F3F3F3" w:val="clear"/>
         <w:spacing w:after="0"/>
       </w:pPr>
@@ -1190,6 +1288,8 @@
     </w:p>
     <w:p>
       <w:pPr>
+        <w:keepNext/>
+        <w:keepLines/>
         <w:shd w:fill="F3F3F3" w:val="clear"/>
         <w:spacing w:after="0"/>
       </w:pPr>
@@ -1204,6 +1304,8 @@
     </w:p>
     <w:p>
       <w:pPr>
+        <w:keepNext/>
+        <w:keepLines/>
         <w:shd w:fill="F3F3F3" w:val="clear"/>
         <w:spacing w:after="0"/>
       </w:pPr>
@@ -1218,6 +1320,8 @@
     </w:p>
     <w:p>
       <w:pPr>
+        <w:keepNext/>
+        <w:keepLines/>
         <w:shd w:fill="F3F3F3" w:val="clear"/>
         <w:spacing w:after="0"/>
       </w:pPr>
@@ -1232,6 +1336,8 @@
     </w:p>
     <w:p>
       <w:pPr>
+        <w:keepNext/>
+        <w:keepLines/>
         <w:shd w:fill="F3F3F3" w:val="clear"/>
         <w:spacing w:after="0"/>
       </w:pPr>
@@ -1246,6 +1352,8 @@
     </w:p>
     <w:p>
       <w:pPr>
+        <w:keepNext/>
+        <w:keepLines/>
         <w:shd w:fill="F3F3F3" w:val="clear"/>
         <w:spacing w:after="0"/>
       </w:pPr>
@@ -1260,6 +1368,8 @@
     </w:p>
     <w:p>
       <w:pPr>
+        <w:keepNext/>
+        <w:keepLines/>
         <w:shd w:fill="F3F3F3" w:val="clear"/>
         <w:spacing w:after="0"/>
       </w:pPr>
@@ -1274,6 +1384,8 @@
     </w:p>
     <w:p>
       <w:pPr>
+        <w:keepNext/>
+        <w:keepLines/>
         <w:shd w:fill="F3F3F3" w:val="clear"/>
         <w:spacing w:after="0"/>
       </w:pPr>
@@ -1288,6 +1400,8 @@
     </w:p>
     <w:p>
       <w:pPr>
+        <w:keepNext/>
+        <w:keepLines/>
         <w:shd w:fill="F3F3F3" w:val="clear"/>
         <w:spacing w:after="0"/>
       </w:pPr>
@@ -1302,6 +1416,8 @@
     </w:p>
     <w:p>
       <w:pPr>
+        <w:keepNext/>
+        <w:keepLines/>
         <w:shd w:fill="F3F3F3" w:val="clear"/>
         <w:spacing w:after="0"/>
       </w:pPr>
@@ -1316,6 +1432,8 @@
     </w:p>
     <w:p>
       <w:pPr>
+        <w:keepNext/>
+        <w:keepLines/>
         <w:shd w:fill="F3F3F3" w:val="clear"/>
         <w:spacing w:after="0"/>
       </w:pPr>
@@ -1330,6 +1448,8 @@
     </w:p>
     <w:p>
       <w:pPr>
+        <w:keepNext/>
+        <w:keepLines/>
         <w:shd w:fill="F3F3F3" w:val="clear"/>
         <w:spacing w:after="0"/>
       </w:pPr>
@@ -1344,6 +1464,8 @@
     </w:p>
     <w:p>
       <w:pPr>
+        <w:keepNext/>
+        <w:keepLines/>
         <w:shd w:fill="F3F3F3" w:val="clear"/>
         <w:spacing w:after="0"/>
       </w:pPr>
@@ -1358,6 +1480,8 @@
     </w:p>
     <w:p>
       <w:pPr>
+        <w:keepNext/>
+        <w:keepLines/>
         <w:shd w:fill="F3F3F3" w:val="clear"/>
         <w:spacing w:after="0"/>
       </w:pPr>
@@ -1372,6 +1496,8 @@
     </w:p>
     <w:p>
       <w:pPr>
+        <w:keepNext/>
+        <w:keepLines/>
         <w:shd w:fill="F3F3F3" w:val="clear"/>
         <w:spacing w:after="0"/>
       </w:pPr>
@@ -1386,6 +1512,8 @@
     </w:p>
     <w:p>
       <w:pPr>
+        <w:keepNext/>
+        <w:keepLines/>
         <w:shd w:fill="F3F3F3" w:val="clear"/>
         <w:spacing w:after="0"/>
       </w:pPr>
@@ -1400,6 +1528,8 @@
     </w:p>
     <w:p>
       <w:pPr>
+        <w:keepNext/>
+        <w:keepLines/>
         <w:shd w:fill="F3F3F3" w:val="clear"/>
         <w:spacing w:after="0"/>
       </w:pPr>
@@ -3171,7 +3301,7 @@
       <w:r>
         <w:drawing>
           <wp:inline distT="0" distB="0" distL="0" distR="0">
-            <wp:extent cx="5334000" cy="3333750"/>
+            <wp:extent cx="5715000" cy="3571875"/>
             <wp:effectExtent t="0" r="0" b="0" l="0"/>
             <wp:docPr id="1" name="a1_idade_20.png" descr="Figura 1 — Atividade 1: entrada 20 (Maior de idade)." title="Figura 1 — Atividade 1: entrada 20 (Maior de idade)."/>
             <wp:cNvGraphicFramePr>
@@ -3196,7 +3326,7 @@
                   <pic:spPr bwMode="auto">
                     <a:xfrm>
                       <a:off x="0" y="0"/>
-                      <a:ext cx="5334000" cy="3333750"/>
+                      <a:ext cx="5715000" cy="3571875"/>
                     </a:xfrm>
                     <a:prstGeom prst="rect">
                       <a:avLst/>
@@ -3232,7 +3362,7 @@
       <w:r>
         <w:drawing>
           <wp:inline distT="0" distB="0" distL="0" distR="0">
-            <wp:extent cx="5334000" cy="3333750"/>
+            <wp:extent cx="5715000" cy="3571875"/>
             <wp:effectExtent t="0" r="0" b="0" l="0"/>
             <wp:docPr id="1" name="a1_idade_17.png" descr="Figura 2 — Atividade 1: entrada 17 (Menor de idade)." title="Figura 2 — Atividade 1: entrada 17 (Menor de idade)."/>
             <wp:cNvGraphicFramePr>
@@ -3257,7 +3387,7 @@
                   <pic:spPr bwMode="auto">
                     <a:xfrm>
                       <a:off x="0" y="0"/>
-                      <a:ext cx="5334000" cy="3333750"/>
+                      <a:ext cx="5715000" cy="3571875"/>
                     </a:xfrm>
                     <a:prstGeom prst="rect">
                       <a:avLst/>
@@ -3293,7 +3423,7 @@
       <w:r>
         <w:drawing>
           <wp:inline distT="0" distB="0" distL="0" distR="0">
-            <wp:extent cx="5334000" cy="3333750"/>
+            <wp:extent cx="5715000" cy="3571875"/>
             <wp:effectExtent t="0" r="0" b="0" l="0"/>
             <wp:docPr id="1" name="a1_idade_18.png" descr="Figura 3 — Atividade 1: entrada 18, valor-limite (Maior de idade)." title="Figura 3 — Atividade 1: entrada 18, valor-limite (Maior de idade)."/>
             <wp:cNvGraphicFramePr>
@@ -3318,7 +3448,7 @@
                   <pic:spPr bwMode="auto">
                     <a:xfrm>
                       <a:off x="0" y="0"/>
-                      <a:ext cx="5334000" cy="3333750"/>
+                      <a:ext cx="5715000" cy="3571875"/>
                     </a:xfrm>
                     <a:prstGeom prst="rect">
                       <a:avLst/>
@@ -3354,7 +3484,7 @@
       <w:r>
         <w:drawing>
           <wp:inline distT="0" distB="0" distL="0" distR="0">
-            <wp:extent cx="5334000" cy="3333750"/>
+            <wp:extent cx="5715000" cy="3571875"/>
             <wp:effectExtent t="0" r="0" b="0" l="0"/>
             <wp:docPr id="1" name="a1_idade_0.png" descr="Figura 4 — Atividade 1: entrada 0 (Menor de idade)." title="Figura 4 — Atividade 1: entrada 0 (Menor de idade)."/>
             <wp:cNvGraphicFramePr>
@@ -3379,7 +3509,7 @@
                   <pic:spPr bwMode="auto">
                     <a:xfrm>
                       <a:off x="0" y="0"/>
-                      <a:ext cx="5334000" cy="3333750"/>
+                      <a:ext cx="5715000" cy="3571875"/>
                     </a:xfrm>
                     <a:prstGeom prst="rect">
                       <a:avLst/>
@@ -3424,6 +3554,20 @@
     </w:p>
     <w:p>
       <w:pPr>
+        <w:spacing w:after="120" w:line="360"/>
+        <w:jc w:val="both"/>
+      </w:pPr>
+      <w:r>
+        <w:rPr>
+          <w:rFonts w:ascii="Arial" w:cs="Arial" w:eastAsia="Arial" w:hAnsi="Arial"/>
+          <w:sz w:val="24"/>
+          <w:szCs w:val="24"/>
+        </w:rPr>
+        <w:t xml:space="preserve">A Figura 5 mostra o código completo da Atividade 2 e uma execução completa (A = 10 e B = 5). As Figuras 6 a 10 são recortes do painel “Saída” das capturas originais de cada teste, ampliados para facilitar a leitura; os recortes apenas delimitam a área da tela e não alteram o conteúdo.</w:t>
+      </w:r>
+    </w:p>
+    <w:p>
+      <w:pPr>
         <w:keepNext/>
         <w:spacing w:after="60" w:before="120"/>
         <w:jc w:val="center"/>
@@ -3431,9 +3575,9 @@
       <w:r>
         <w:drawing>
           <wp:inline distT="0" distB="0" distL="0" distR="0">
-            <wp:extent cx="3810000" cy="3867150"/>
+            <wp:extent cx="4476750" cy="4543425"/>
             <wp:effectExtent t="0" r="0" b="0" l="0"/>
-            <wp:docPr id="1" name="a2_2_elev_3.png" descr="Figura 5 — Atividade 2: A = 2 e B = 3 (resultado 8)." title="Figura 5 — Atividade 2: A = 2 e B = 3 (resultado 8)."/>
+            <wp:docPr id="1" name="a2_10_elev_5.png" descr="Figura 5 — Atividade 2: código completo e execução com A = 10 e B = 5." title="Figura 5 — Atividade 2: código completo e execução com A = 10 e B = 5."/>
             <wp:cNvGraphicFramePr>
               <a:graphicFrameLocks xmlns:a="http://schemas.openxmlformats.org/drawingml/2006/main" noChangeAspect="1"/>
             </wp:cNvGraphicFramePr>
@@ -3456,7 +3600,7 @@
                   <pic:spPr bwMode="auto">
                     <a:xfrm>
                       <a:off x="0" y="0"/>
-                      <a:ext cx="3810000" cy="3867150"/>
+                      <a:ext cx="4476750" cy="4543425"/>
                     </a:xfrm>
                     <a:prstGeom prst="rect">
                       <a:avLst/>
@@ -3480,7 +3624,7 @@
           <w:sz w:val="20"/>
           <w:szCs w:val="20"/>
         </w:rPr>
-        <w:t xml:space="preserve">Figura 5 — Atividade 2: A = 2 e B = 3 (resultado 8).</w:t>
+        <w:t xml:space="preserve">Figura 5 — Atividade 2: código completo e execução com A = 10 e B = 5.</w:t>
       </w:r>
     </w:p>
     <w:p>
@@ -3492,9 +3636,9 @@
       <w:r>
         <w:drawing>
           <wp:inline distT="0" distB="0" distL="0" distR="0">
-            <wp:extent cx="3810000" cy="3867150"/>
+            <wp:extent cx="4762500" cy="790575"/>
             <wp:effectExtent t="0" r="0" b="0" l="0"/>
-            <wp:docPr id="1" name="a2_5_elev_1.png" descr="Figura 6 — Atividade 2: A = 5 e B = 1 (resultado 5)." title="Figura 6 — Atividade 2: A = 5 e B = 1 (resultado 5)."/>
+            <wp:docPr id="1" name="a2_2_elev_3_saida.png" descr="Figura 6 — Atividade 2: A = 2 e B = 3 (resultado 8)." title="Figura 6 — Atividade 2: A = 2 e B = 3 (resultado 8)."/>
             <wp:cNvGraphicFramePr>
               <a:graphicFrameLocks xmlns:a="http://schemas.openxmlformats.org/drawingml/2006/main" noChangeAspect="1"/>
             </wp:cNvGraphicFramePr>
@@ -3517,7 +3661,7 @@
                   <pic:spPr bwMode="auto">
                     <a:xfrm>
                       <a:off x="0" y="0"/>
-                      <a:ext cx="3810000" cy="3867150"/>
+                      <a:ext cx="4762500" cy="790575"/>
                     </a:xfrm>
                     <a:prstGeom prst="rect">
                       <a:avLst/>
@@ -3541,7 +3685,7 @@
           <w:sz w:val="20"/>
           <w:szCs w:val="20"/>
         </w:rPr>
-        <w:t xml:space="preserve">Figura 6 — Atividade 2: A = 5 e B = 1 (resultado 5).</w:t>
+        <w:t xml:space="preserve">Figura 6 — Atividade 2: A = 2 e B = 3 (resultado 8).</w:t>
       </w:r>
     </w:p>
     <w:p>
@@ -3553,9 +3697,9 @@
       <w:r>
         <w:drawing>
           <wp:inline distT="0" distB="0" distL="0" distR="0">
-            <wp:extent cx="3810000" cy="3867150"/>
+            <wp:extent cx="4762500" cy="790575"/>
             <wp:effectExtent t="0" r="0" b="0" l="0"/>
-            <wp:docPr id="1" name="a2_3_elev_4.png" descr="Figura 7 — Atividade 2: A = 3 e B = 4 (resultado 81)." title="Figura 7 — Atividade 2: A = 3 e B = 4 (resultado 81)."/>
+            <wp:docPr id="1" name="a2_5_elev_1_saida.png" descr="Figura 7 — Atividade 2: A = 5 e B = 1 (resultado 5)." title="Figura 7 — Atividade 2: A = 5 e B = 1 (resultado 5)."/>
             <wp:cNvGraphicFramePr>
               <a:graphicFrameLocks xmlns:a="http://schemas.openxmlformats.org/drawingml/2006/main" noChangeAspect="1"/>
             </wp:cNvGraphicFramePr>
@@ -3578,7 +3722,7 @@
                   <pic:spPr bwMode="auto">
                     <a:xfrm>
                       <a:off x="0" y="0"/>
-                      <a:ext cx="3810000" cy="3867150"/>
+                      <a:ext cx="4762500" cy="790575"/>
                     </a:xfrm>
                     <a:prstGeom prst="rect">
                       <a:avLst/>
@@ -3602,7 +3746,7 @@
           <w:sz w:val="20"/>
           <w:szCs w:val="20"/>
         </w:rPr>
-        <w:t xml:space="preserve">Figura 7 — Atividade 2: A = 3 e B = 4 (resultado 81).</w:t>
+        <w:t xml:space="preserve">Figura 7 — Atividade 2: A = 5 e B = 1 (resultado 5).</w:t>
       </w:r>
     </w:p>
     <w:p>
@@ -3614,9 +3758,9 @@
       <w:r>
         <w:drawing>
           <wp:inline distT="0" distB="0" distL="0" distR="0">
-            <wp:extent cx="3810000" cy="3867150"/>
+            <wp:extent cx="4762500" cy="790575"/>
             <wp:effectExtent t="0" r="0" b="0" l="0"/>
-            <wp:docPr id="1" name="a2_10_elev_5.png" descr="Figura 8 — Atividade 2: A = 10 e B = 5 (resultado 100000)." title="Figura 8 — Atividade 2: A = 10 e B = 5 (resultado 100000)."/>
+            <wp:docPr id="1" name="a2_3_elev_4_saida.png" descr="Figura 8 — Atividade 2: A = 3 e B = 4 (resultado 81)." title="Figura 8 — Atividade 2: A = 3 e B = 4 (resultado 81)."/>
             <wp:cNvGraphicFramePr>
               <a:graphicFrameLocks xmlns:a="http://schemas.openxmlformats.org/drawingml/2006/main" noChangeAspect="1"/>
             </wp:cNvGraphicFramePr>
@@ -3639,7 +3783,7 @@
                   <pic:spPr bwMode="auto">
                     <a:xfrm>
                       <a:off x="0" y="0"/>
-                      <a:ext cx="3810000" cy="3867150"/>
+                      <a:ext cx="4762500" cy="790575"/>
                     </a:xfrm>
                     <a:prstGeom prst="rect">
                       <a:avLst/>
@@ -3663,7 +3807,7 @@
           <w:sz w:val="20"/>
           <w:szCs w:val="20"/>
         </w:rPr>
-        <w:t xml:space="preserve">Figura 8 — Atividade 2: A = 10 e B = 5 (resultado 100000).</w:t>
+        <w:t xml:space="preserve">Figura 8 — Atividade 2: A = 3 e B = 4 (resultado 81).</w:t>
       </w:r>
     </w:p>
     <w:p>
@@ -3675,9 +3819,9 @@
       <w:r>
         <w:drawing>
           <wp:inline distT="0" distB="0" distL="0" distR="0">
-            <wp:extent cx="3810000" cy="3867150"/>
+            <wp:extent cx="4762500" cy="790575"/>
             <wp:effectExtent t="0" r="0" b="0" l="0"/>
-            <wp:docPr id="1" name="a2_invalido_0.png" descr="Figura 9 — Atividade 2: A = 0 e B = 3 (entrada inválida)." title="Figura 9 — Atividade 2: A = 0 e B = 3 (entrada inválida)."/>
+            <wp:docPr id="1" name="a2_10_elev_5_saida.png" descr="Figura 9 — Atividade 2: A = 10 e B = 5 (resultado 100000)." title="Figura 9 — Atividade 2: A = 10 e B = 5 (resultado 100000)."/>
             <wp:cNvGraphicFramePr>
               <a:graphicFrameLocks xmlns:a="http://schemas.openxmlformats.org/drawingml/2006/main" noChangeAspect="1"/>
             </wp:cNvGraphicFramePr>
@@ -3700,7 +3844,7 @@
                   <pic:spPr bwMode="auto">
                     <a:xfrm>
                       <a:off x="0" y="0"/>
-                      <a:ext cx="3810000" cy="3867150"/>
+                      <a:ext cx="4762500" cy="790575"/>
                     </a:xfrm>
                     <a:prstGeom prst="rect">
                       <a:avLst/>
@@ -3724,7 +3868,68 @@
           <w:sz w:val="20"/>
           <w:szCs w:val="20"/>
         </w:rPr>
-        <w:t xml:space="preserve">Figura 9 — Atividade 2: A = 0 e B = 3 (entrada inválida).</w:t>
+        <w:t xml:space="preserve">Figura 9 — Atividade 2: A = 10 e B = 5 (resultado 100000).</w:t>
+      </w:r>
+    </w:p>
+    <w:p>
+      <w:pPr>
+        <w:keepNext/>
+        <w:spacing w:after="60" w:before="120"/>
+        <w:jc w:val="center"/>
+      </w:pPr>
+      <w:r>
+        <w:drawing>
+          <wp:inline distT="0" distB="0" distL="0" distR="0">
+            <wp:extent cx="4762500" cy="790575"/>
+            <wp:effectExtent t="0" r="0" b="0" l="0"/>
+            <wp:docPr id="1" name="a2_invalido_0_saida.png" descr="Figura 10 — Atividade 2: A = 0 e B = 3 (entrada inválida)." title="Figura 10 — Atividade 2: A = 0 e B = 3 (entrada inválida)."/>
+            <wp:cNvGraphicFramePr>
+              <a:graphicFrameLocks xmlns:a="http://schemas.openxmlformats.org/drawingml/2006/main" noChangeAspect="1"/>
+            </wp:cNvGraphicFramePr>
+            <a:graphic xmlns:a="http://schemas.openxmlformats.org/drawingml/2006/main">
+              <a:graphicData uri="http://schemas.openxmlformats.org/drawingml/2006/picture">
+                <pic:pic xmlns:pic="http://schemas.openxmlformats.org/drawingml/2006/picture">
+                  <pic:nvPicPr>
+                    <pic:cNvPr id="0" name="" descr=""/>
+                    <pic:cNvPicPr>
+                      <a:picLocks noChangeAspect="1" noChangeArrowheads="1"/>
+                    </pic:cNvPicPr>
+                  </pic:nvPicPr>
+                  <pic:blipFill>
+                    <a:blip r:embed="rId16" cstate="none"/>
+                    <a:srcRect/>
+                    <a:stretch>
+                      <a:fillRect/>
+                    </a:stretch>
+                  </pic:blipFill>
+                  <pic:spPr bwMode="auto">
+                    <a:xfrm>
+                      <a:off x="0" y="0"/>
+                      <a:ext cx="4762500" cy="790575"/>
+                    </a:xfrm>
+                    <a:prstGeom prst="rect">
+                      <a:avLst/>
+                    </a:prstGeom>
+                  </pic:spPr>
+                </pic:pic>
+              </a:graphicData>
+            </a:graphic>
+          </wp:inline>
+        </w:drawing>
+      </w:r>
+    </w:p>
+    <w:p>
+      <w:pPr>
+        <w:spacing w:after="200"/>
+        <w:jc w:val="center"/>
+      </w:pPr>
+      <w:r>
+        <w:rPr>
+          <w:rFonts w:ascii="Arial" w:cs="Arial" w:eastAsia="Arial" w:hAnsi="Arial"/>
+          <w:sz w:val="20"/>
+          <w:szCs w:val="20"/>
+        </w:rPr>
+        <w:t xml:space="preserve">Figura 10 — Atividade 2: A = 0 e B = 3 (entrada inválida).</w:t>
       </w:r>
     </w:p>
     <w:p>

</xml_diff>